<commit_message>
Renombrar columnas del detalle de la proforma
"Trabajo realizado" pasa a "Trabajo por realizar" e "Importe" pasa a
"Coste", en la version web/PDF y en la de Word. Se mantiene el "S/" en
la cabecera de la columna porque es la unica marca de moneda del cuadro.

Co-Authored-By: Claude Opus 5 <noreply@anthropic.com>
Claude-Session: https://claude.ai/code/session_01EAxoWDzBm6hR4XtGMHBt1M
</commit_message>
<xml_diff>
--- a/Proforma-ABARCA-Nissan-BUX-222.docx
+++ b/Proforma-ABARCA-Nissan-BUX-222.docx
@@ -1398,7 +1398,7 @@
                 <w:sz w:val="20"/>
                 <w:szCs w:val="20"/>
               </w:rPr>
-              <w:t xml:space="preserve">DESCRIPCIÓN DEL TRABAJO</w:t>
+              <w:t xml:space="preserve">TRABAJO POR REALIZAR</w:t>
             </w:r>
           </w:p>
         </w:tc>
@@ -1470,7 +1470,7 @@
                 <w:sz w:val="20"/>
                 <w:szCs w:val="20"/>
               </w:rPr>
-              <w:t xml:space="preserve">IMPORTE S/</w:t>
+              <w:t xml:space="preserve">COSTE S/</w:t>
             </w:r>
           </w:p>
         </w:tc>

</xml_diff>

<commit_message>
Rehacer la descripcion como las dos cajas de la plantilla real
Segun la referencia del taller, el detalle no es una tabla de filas sino
dos cajas lado a lado: "SERVICIO DE PINTURA" y "SERVICIO DE CAMBIO E
INSTALACION METALICO", cada una con sus lineas numeradas y el precio en
la misma linea ("1.-Pintura de panel izquierdo S/.600"), y al pie de la
caja derecha las dos notas de plazo e IGV.

El espacio en blanco que sobra se conserva: las cajas tienen alto minimo
y no se rellena ni se apila nada para taparlo. Todo entra en una hoja A4.

Co-Authored-By: Claude Opus 5 <noreply@anthropic.com>
Claude-Session: https://claude.ai/code/session_01EAxoWDzBm6hR4XtGMHBt1M
</commit_message>
<xml_diff>
--- a/Proforma-ABARCA-Nissan-BUX-222.docx
+++ b/Proforma-ABARCA-Nissan-BUX-222.docx
@@ -1322,37 +1322,255 @@
         </w:tblBorders>
       </w:tblPr>
       <w:tblGrid>
-        <w:gridCol w:w="700"/>
-        <w:gridCol w:w="5478"/>
-        <w:gridCol w:w="2000"/>
+        <w:gridCol w:w="5089"/>
+        <w:gridCol w:w="5089"/>
+      </w:tblGrid>
+      <w:tr>
+        <w:trPr>
+          <w:trHeight w:val="2900" w:hRule="atLeast"/>
+        </w:trPr>
+        <w:tc>
+          <w:tcPr>
+            <w:tcW w:type="dxa" w:w="5089"/>
+            <w:tcBorders>
+              <w:top w:val="single" w:color="808080" w:sz="6"/>
+              <w:left w:val="single" w:color="808080" w:sz="6"/>
+              <w:bottom w:val="none" w:color="FFFFFF" w:sz="0"/>
+              <w:right w:val="single" w:color="808080" w:sz="6"/>
+            </w:tcBorders>
+            <w:tcMar>
+              <w:top w:type="dxa" w:w="60"/>
+              <w:left w:type="dxa" w:w="100"/>
+              <w:bottom w:type="dxa" w:w="60"/>
+              <w:right w:type="dxa" w:w="100"/>
+            </w:tcMar>
+            <w:vAlign w:val="top"/>
+          </w:tcPr>
+          <w:p>
+            <w:pPr>
+              <w:spacing w:after="90" w:before="0"/>
+            </w:pPr>
+            <w:r>
+              <w:rPr>
+                <w:rFonts w:ascii="Calibri" w:cs="Calibri" w:eastAsia="Calibri" w:hAnsi="Calibri"/>
+                <w:b/>
+                <w:bCs/>
+                <w:color w:val="1A1A1A"/>
+                <w:sz w:val="19"/>
+                <w:szCs w:val="19"/>
+                <w:u w:val="single"/>
+              </w:rPr>
+              <w:t xml:space="preserve">SERVICIO DE PINTURA:</w:t>
+            </w:r>
+          </w:p>
+          <w:p>
+            <w:pPr>
+              <w:spacing w:after="50" w:before="0"/>
+            </w:pPr>
+            <w:r>
+              <w:rPr>
+                <w:rFonts w:ascii="Calibri" w:cs="Calibri" w:eastAsia="Calibri" w:hAnsi="Calibri"/>
+                <w:b w:val="false"/>
+                <w:bCs w:val="false"/>
+                <w:color w:val="1A1A1A"/>
+                <w:sz w:val="18"/>
+                <w:szCs w:val="18"/>
+              </w:rPr>
+              <w:t xml:space="preserve">1.-Pintura de panel izquierdo S/.600</w:t>
+            </w:r>
+          </w:p>
+        </w:tc>
+        <w:tc>
+          <w:tcPr>
+            <w:tcW w:type="dxa" w:w="5089"/>
+            <w:tcBorders>
+              <w:top w:val="single" w:color="808080" w:sz="6"/>
+              <w:left w:val="single" w:color="808080" w:sz="6"/>
+              <w:bottom w:val="none" w:color="FFFFFF" w:sz="0"/>
+              <w:right w:val="single" w:color="808080" w:sz="6"/>
+            </w:tcBorders>
+            <w:tcMar>
+              <w:top w:type="dxa" w:w="60"/>
+              <w:left w:type="dxa" w:w="100"/>
+              <w:bottom w:type="dxa" w:w="60"/>
+              <w:right w:type="dxa" w:w="100"/>
+            </w:tcMar>
+            <w:vAlign w:val="top"/>
+          </w:tcPr>
+          <w:p>
+            <w:pPr>
+              <w:spacing w:after="90" w:before="0"/>
+            </w:pPr>
+            <w:r>
+              <w:rPr>
+                <w:rFonts w:ascii="Calibri" w:cs="Calibri" w:eastAsia="Calibri" w:hAnsi="Calibri"/>
+                <w:b/>
+                <w:bCs/>
+                <w:color w:val="1A1A1A"/>
+                <w:sz w:val="19"/>
+                <w:szCs w:val="19"/>
+                <w:u w:val="single"/>
+              </w:rPr>
+              <w:t xml:space="preserve">SERVICIO DE CAMBIO E INSTALACION METÁLICO:</w:t>
+            </w:r>
+          </w:p>
+          <w:p>
+            <w:pPr>
+              <w:spacing w:after="0" w:before="0"/>
+            </w:pPr>
+            <w:r>
+              <w:rPr>
+                <w:rFonts w:ascii="Calibri" w:cs="Calibri" w:eastAsia="Calibri" w:hAnsi="Calibri"/>
+                <w:b w:val="false"/>
+                <w:bCs w:val="false"/>
+                <w:color w:val="1A1A1A"/>
+                <w:sz w:val="20"/>
+                <w:szCs w:val="20"/>
+              </w:rPr>
+              <w:t xml:space="preserve"/>
+            </w:r>
+          </w:p>
+        </w:tc>
+      </w:tr>
+      <w:tr>
+        <w:tc>
+          <w:tcPr>
+            <w:tcW w:type="dxa" w:w="5089"/>
+            <w:tcBorders>
+              <w:top w:val="none" w:color="FFFFFF" w:sz="0"/>
+              <w:left w:val="single" w:color="808080" w:sz="6"/>
+              <w:bottom w:val="single" w:color="808080" w:sz="6"/>
+              <w:right w:val="single" w:color="808080" w:sz="6"/>
+            </w:tcBorders>
+            <w:tcMar>
+              <w:top w:type="dxa" w:w="60"/>
+              <w:left w:type="dxa" w:w="100"/>
+              <w:bottom w:type="dxa" w:w="60"/>
+              <w:right w:type="dxa" w:w="100"/>
+            </w:tcMar>
+            <w:vAlign w:val="bottom"/>
+          </w:tcPr>
+          <w:p>
+            <w:r>
+              <w:rPr>
+                <w:rFonts w:ascii="Calibri" w:cs="Calibri" w:eastAsia="Calibri" w:hAnsi="Calibri"/>
+                <w:b w:val="false"/>
+                <w:bCs w:val="false"/>
+                <w:color w:val="1A1A1A"/>
+                <w:sz w:val="20"/>
+                <w:szCs w:val="20"/>
+              </w:rPr>
+              <w:t xml:space="preserve"/>
+            </w:r>
+          </w:p>
+        </w:tc>
+        <w:tc>
+          <w:tcPr>
+            <w:tcW w:type="dxa" w:w="5089"/>
+            <w:tcBorders>
+              <w:top w:val="none" w:color="FFFFFF" w:sz="0"/>
+              <w:left w:val="single" w:color="808080" w:sz="6"/>
+              <w:bottom w:val="single" w:color="808080" w:sz="6"/>
+              <w:right w:val="single" w:color="808080" w:sz="6"/>
+            </w:tcBorders>
+            <w:tcMar>
+              <w:top w:type="dxa" w:w="60"/>
+              <w:left w:type="dxa" w:w="100"/>
+              <w:bottom w:type="dxa" w:w="60"/>
+              <w:right w:type="dxa" w:w="100"/>
+            </w:tcMar>
+            <w:vAlign w:val="bottom"/>
+          </w:tcPr>
+          <w:p>
+            <w:pPr>
+              <w:spacing w:after="0" w:before="0"/>
+            </w:pPr>
+            <w:r>
+              <w:rPr>
+                <w:rFonts w:ascii="Calibri" w:cs="Calibri" w:eastAsia="Calibri" w:hAnsi="Calibri"/>
+                <w:b w:val="false"/>
+                <w:bCs w:val="false"/>
+                <w:color w:val="1A1A1A"/>
+                <w:sz w:val="17"/>
+                <w:szCs w:val="17"/>
+              </w:rPr>
+              <w:t xml:space="preserve">***TRABAJO A REALIZAR EN 2 A 4 DÍAS HÁBILES.</w:t>
+            </w:r>
+          </w:p>
+          <w:p>
+            <w:pPr>
+              <w:spacing w:after="0" w:before="40"/>
+            </w:pPr>
+            <w:r>
+              <w:rPr>
+                <w:rFonts w:ascii="Calibri" w:cs="Calibri" w:eastAsia="Calibri" w:hAnsi="Calibri"/>
+                <w:b w:val="false"/>
+                <w:bCs w:val="false"/>
+                <w:color w:val="595959"/>
+                <w:sz w:val="13"/>
+                <w:szCs w:val="13"/>
+              </w:rPr>
+              <w:t xml:space="preserve">***Todo presupuesto con factura se aplica más el 18% de IGV.</w:t>
+            </w:r>
+          </w:p>
+        </w:tc>
+      </w:tr>
+    </w:tbl>
+    <w:p>
+      <w:pPr>
+        <w:spacing w:after="120" w:before="0"/>
+      </w:pPr>
+      <w:r>
+        <w:rPr>
+          <w:rFonts w:ascii="Calibri" w:cs="Calibri" w:eastAsia="Calibri" w:hAnsi="Calibri"/>
+          <w:b w:val="false"/>
+          <w:bCs w:val="false"/>
+          <w:color w:val="1A1A1A"/>
+          <w:sz w:val="20"/>
+          <w:szCs w:val="20"/>
+        </w:rPr>
+        <w:t xml:space="preserve"/>
+      </w:r>
+    </w:p>
+    <w:tbl>
+      <w:tblPr>
+        <w:tblW w:type="dxa" w:w="5200"/>
+        <w:jc w:val="right"/>
+        <w:tblBorders>
+          <w:top w:val="single" w:color="auto" w:sz="4"/>
+          <w:left w:val="single" w:color="auto" w:sz="4"/>
+          <w:bottom w:val="single" w:color="auto" w:sz="4"/>
+          <w:right w:val="single" w:color="auto" w:sz="4"/>
+          <w:insideH w:val="single" w:color="auto" w:sz="4"/>
+          <w:insideV w:val="single" w:color="auto" w:sz="4"/>
+        </w:tblBorders>
+      </w:tblPr>
+      <w:tblGrid>
+        <w:gridCol w:w="3200"/>
         <w:gridCol w:w="2000"/>
       </w:tblGrid>
       <w:tr>
-        <w:trPr>
-          <w:tblHeader/>
-        </w:trPr>
-        <w:tc>
-          <w:tcPr>
-            <w:tcW w:type="dxa" w:w="700"/>
-            <w:tcBorders>
-              <w:top w:val="single" w:color="808080" w:sz="6"/>
-              <w:left w:val="single" w:color="808080" w:sz="6"/>
-              <w:bottom w:val="single" w:color="808080" w:sz="6"/>
-              <w:right w:val="single" w:color="808080" w:sz="6"/>
-            </w:tcBorders>
-            <w:shd w:fill="D9D9D9" w:color="auto" w:val="clear"/>
-            <w:tcMar>
-              <w:top w:type="dxa" w:w="60"/>
-              <w:left w:type="dxa" w:w="100"/>
-              <w:bottom w:type="dxa" w:w="60"/>
-              <w:right w:type="dxa" w:w="100"/>
-            </w:tcMar>
-            <w:vAlign w:val="center"/>
-          </w:tcPr>
-          <w:p>
-            <w:pPr>
-              <w:spacing w:after="20" w:before="20"/>
-              <w:jc w:val="center"/>
+        <w:tc>
+          <w:tcPr>
+            <w:tcW w:type="dxa" w:w="3200"/>
+            <w:tcBorders>
+              <w:top w:val="single" w:color="808080" w:sz="6"/>
+              <w:left w:val="single" w:color="808080" w:sz="6"/>
+              <w:bottom w:val="single" w:color="808080" w:sz="6"/>
+              <w:right w:val="single" w:color="808080" w:sz="6"/>
+            </w:tcBorders>
+            <w:tcMar>
+              <w:top w:type="dxa" w:w="60"/>
+              <w:left w:type="dxa" w:w="100"/>
+              <w:bottom w:type="dxa" w:w="60"/>
+              <w:right w:type="dxa" w:w="100"/>
+            </w:tcMar>
+            <w:vAlign w:val="center"/>
+          </w:tcPr>
+          <w:p>
+            <w:pPr>
+              <w:spacing w:after="20" w:before="20"/>
+              <w:jc w:val="right"/>
             </w:pPr>
             <w:r>
               <w:rPr>
@@ -1363,31 +1581,31 @@
                 <w:sz w:val="20"/>
                 <w:szCs w:val="20"/>
               </w:rPr>
-              <w:t xml:space="preserve">N°</w:t>
-            </w:r>
-          </w:p>
-        </w:tc>
-        <w:tc>
-          <w:tcPr>
-            <w:tcW w:type="dxa" w:w="5478"/>
-            <w:tcBorders>
-              <w:top w:val="single" w:color="808080" w:sz="6"/>
-              <w:left w:val="single" w:color="808080" w:sz="6"/>
-              <w:bottom w:val="single" w:color="808080" w:sz="6"/>
-              <w:right w:val="single" w:color="808080" w:sz="6"/>
-            </w:tcBorders>
-            <w:shd w:fill="D9D9D9" w:color="auto" w:val="clear"/>
-            <w:tcMar>
-              <w:top w:type="dxa" w:w="60"/>
-              <w:left w:type="dxa" w:w="100"/>
-              <w:bottom w:type="dxa" w:w="60"/>
-              <w:right w:type="dxa" w:w="100"/>
-            </w:tcMar>
-            <w:vAlign w:val="center"/>
-          </w:tcPr>
-          <w:p>
-            <w:pPr>
-              <w:spacing w:after="20" w:before="20"/>
+              <w:t xml:space="preserve">SUBTOTAL</w:t>
+            </w:r>
+          </w:p>
+        </w:tc>
+        <w:tc>
+          <w:tcPr>
+            <w:tcW w:type="dxa" w:w="2000"/>
+            <w:tcBorders>
+              <w:top w:val="single" w:color="808080" w:sz="6"/>
+              <w:left w:val="single" w:color="808080" w:sz="6"/>
+              <w:bottom w:val="single" w:color="808080" w:sz="6"/>
+              <w:right w:val="single" w:color="808080" w:sz="6"/>
+            </w:tcBorders>
+            <w:tcMar>
+              <w:top w:type="dxa" w:w="60"/>
+              <w:left w:type="dxa" w:w="100"/>
+              <w:bottom w:type="dxa" w:w="60"/>
+              <w:right w:type="dxa" w:w="100"/>
+            </w:tcMar>
+            <w:vAlign w:val="center"/>
+          </w:tcPr>
+          <w:p>
+            <w:pPr>
+              <w:spacing w:after="20" w:before="20"/>
+              <w:jc w:val="right"/>
             </w:pPr>
             <w:r>
               <w:rPr>
@@ -1398,32 +1616,33 @@
                 <w:sz w:val="20"/>
                 <w:szCs w:val="20"/>
               </w:rPr>
-              <w:t xml:space="preserve">TRABAJO POR REALIZAR</w:t>
-            </w:r>
-          </w:p>
-        </w:tc>
-        <w:tc>
-          <w:tcPr>
-            <w:tcW w:type="dxa" w:w="2000"/>
-            <w:tcBorders>
-              <w:top w:val="single" w:color="808080" w:sz="6"/>
-              <w:left w:val="single" w:color="808080" w:sz="6"/>
-              <w:bottom w:val="single" w:color="808080" w:sz="6"/>
-              <w:right w:val="single" w:color="808080" w:sz="6"/>
-            </w:tcBorders>
-            <w:shd w:fill="D9D9D9" w:color="auto" w:val="clear"/>
-            <w:tcMar>
-              <w:top w:type="dxa" w:w="60"/>
-              <w:left w:type="dxa" w:w="100"/>
-              <w:bottom w:type="dxa" w:w="60"/>
-              <w:right w:type="dxa" w:w="100"/>
-            </w:tcMar>
-            <w:vAlign w:val="center"/>
-          </w:tcPr>
-          <w:p>
-            <w:pPr>
-              <w:spacing w:after="20" w:before="20"/>
-              <w:jc w:val="center"/>
+              <w:t xml:space="preserve">S/ 600.00</w:t>
+            </w:r>
+          </w:p>
+        </w:tc>
+      </w:tr>
+      <w:tr>
+        <w:tc>
+          <w:tcPr>
+            <w:tcW w:type="dxa" w:w="3200"/>
+            <w:tcBorders>
+              <w:top w:val="single" w:color="808080" w:sz="6"/>
+              <w:left w:val="single" w:color="808080" w:sz="6"/>
+              <w:bottom w:val="single" w:color="808080" w:sz="6"/>
+              <w:right w:val="single" w:color="808080" w:sz="6"/>
+            </w:tcBorders>
+            <w:tcMar>
+              <w:top w:type="dxa" w:w="60"/>
+              <w:left w:type="dxa" w:w="100"/>
+              <w:bottom w:type="dxa" w:w="60"/>
+              <w:right w:type="dxa" w:w="100"/>
+            </w:tcMar>
+            <w:vAlign w:val="center"/>
+          </w:tcPr>
+          <w:p>
+            <w:pPr>
+              <w:spacing w:after="20" w:before="20"/>
+              <w:jc w:val="right"/>
             </w:pPr>
             <w:r>
               <w:rPr>
@@ -1434,7 +1653,7 @@
                 <w:sz w:val="20"/>
                 <w:szCs w:val="20"/>
               </w:rPr>
-              <w:t xml:space="preserve">OBSERVACIÓN</w:t>
+              <w:t xml:space="preserve">IGV (18%)</w:t>
             </w:r>
           </w:p>
         </w:tc>
@@ -1447,7 +1666,6 @@
               <w:bottom w:val="single" w:color="808080" w:sz="6"/>
               <w:right w:val="single" w:color="808080" w:sz="6"/>
             </w:tcBorders>
-            <w:shd w:fill="D9D9D9" w:color="auto" w:val="clear"/>
             <w:tcMar>
               <w:top w:type="dxa" w:w="60"/>
               <w:left w:type="dxa" w:w="100"/>
@@ -1470,7 +1688,7 @@
                 <w:sz w:val="20"/>
                 <w:szCs w:val="20"/>
               </w:rPr>
-              <w:t xml:space="preserve">COSTE S/</w:t>
+              <w:t xml:space="preserve">S/ 108.00</w:t>
             </w:r>
           </w:p>
         </w:tc>
@@ -1478,294 +1696,7 @@
       <w:tr>
         <w:tc>
           <w:tcPr>
-            <w:tcW w:type="dxa" w:w="700"/>
-            <w:tcBorders>
-              <w:top w:val="single" w:color="808080" w:sz="6"/>
-              <w:left w:val="single" w:color="808080" w:sz="6"/>
-              <w:bottom w:val="single" w:color="808080" w:sz="6"/>
-              <w:right w:val="single" w:color="808080" w:sz="6"/>
-            </w:tcBorders>
-            <w:tcMar>
-              <w:top w:type="dxa" w:w="60"/>
-              <w:left w:type="dxa" w:w="100"/>
-              <w:bottom w:type="dxa" w:w="60"/>
-              <w:right w:type="dxa" w:w="100"/>
-            </w:tcMar>
-            <w:vAlign w:val="center"/>
-          </w:tcPr>
-          <w:p>
-            <w:pPr>
-              <w:spacing w:after="20" w:before="20"/>
-              <w:jc w:val="center"/>
-            </w:pPr>
-            <w:r>
-              <w:rPr>
-                <w:rFonts w:ascii="Calibri" w:cs="Calibri" w:eastAsia="Calibri" w:hAnsi="Calibri"/>
-                <w:b w:val="false"/>
-                <w:bCs w:val="false"/>
-                <w:color w:val="1A1A1A"/>
-                <w:sz w:val="20"/>
-                <w:szCs w:val="20"/>
-              </w:rPr>
-              <w:t xml:space="preserve">1</w:t>
-            </w:r>
-          </w:p>
-        </w:tc>
-        <w:tc>
-          <w:tcPr>
-            <w:tcW w:type="dxa" w:w="5478"/>
-            <w:tcBorders>
-              <w:top w:val="single" w:color="808080" w:sz="6"/>
-              <w:left w:val="single" w:color="808080" w:sz="6"/>
-              <w:bottom w:val="single" w:color="808080" w:sz="6"/>
-              <w:right w:val="single" w:color="808080" w:sz="6"/>
-            </w:tcBorders>
-            <w:tcMar>
-              <w:top w:type="dxa" w:w="60"/>
-              <w:left w:type="dxa" w:w="100"/>
-              <w:bottom w:type="dxa" w:w="60"/>
-              <w:right w:type="dxa" w:w="100"/>
-            </w:tcMar>
-            <w:vAlign w:val="center"/>
-          </w:tcPr>
-          <w:p>
-            <w:pPr>
-              <w:spacing w:after="20" w:before="20"/>
-            </w:pPr>
-            <w:r>
-              <w:rPr>
-                <w:rFonts w:ascii="Calibri" w:cs="Calibri" w:eastAsia="Calibri" w:hAnsi="Calibri"/>
-                <w:b w:val="false"/>
-                <w:bCs w:val="false"/>
-                <w:color w:val="1A1A1A"/>
-                <w:sz w:val="20"/>
-                <w:szCs w:val="20"/>
-              </w:rPr>
-              <w:t xml:space="preserve">Pintura de panel izquierdo</w:t>
-            </w:r>
-          </w:p>
-        </w:tc>
-        <w:tc>
-          <w:tcPr>
-            <w:tcW w:type="dxa" w:w="2000"/>
-            <w:tcBorders>
-              <w:top w:val="single" w:color="808080" w:sz="6"/>
-              <w:left w:val="single" w:color="808080" w:sz="6"/>
-              <w:bottom w:val="single" w:color="808080" w:sz="6"/>
-              <w:right w:val="single" w:color="808080" w:sz="6"/>
-            </w:tcBorders>
-            <w:tcMar>
-              <w:top w:type="dxa" w:w="60"/>
-              <w:left w:type="dxa" w:w="100"/>
-              <w:bottom w:type="dxa" w:w="60"/>
-              <w:right w:type="dxa" w:w="100"/>
-            </w:tcMar>
-            <w:vAlign w:val="center"/>
-          </w:tcPr>
-          <w:p>
-            <w:pPr>
-              <w:spacing w:after="20" w:before="20"/>
-            </w:pPr>
-            <w:r>
-              <w:rPr>
-                <w:rFonts w:ascii="Calibri" w:cs="Calibri" w:eastAsia="Calibri" w:hAnsi="Calibri"/>
-                <w:b w:val="false"/>
-                <w:bCs w:val="false"/>
-                <w:color w:val="1A1A1A"/>
-                <w:sz w:val="20"/>
-                <w:szCs w:val="20"/>
-              </w:rPr>
-              <w:t xml:space="preserve"/>
-            </w:r>
-          </w:p>
-        </w:tc>
-        <w:tc>
-          <w:tcPr>
-            <w:tcW w:type="dxa" w:w="2000"/>
-            <w:tcBorders>
-              <w:top w:val="single" w:color="808080" w:sz="6"/>
-              <w:left w:val="single" w:color="808080" w:sz="6"/>
-              <w:bottom w:val="single" w:color="808080" w:sz="6"/>
-              <w:right w:val="single" w:color="808080" w:sz="6"/>
-            </w:tcBorders>
-            <w:tcMar>
-              <w:top w:type="dxa" w:w="60"/>
-              <w:left w:type="dxa" w:w="100"/>
-              <w:bottom w:type="dxa" w:w="60"/>
-              <w:right w:type="dxa" w:w="100"/>
-            </w:tcMar>
-            <w:vAlign w:val="center"/>
-          </w:tcPr>
-          <w:p>
-            <w:pPr>
-              <w:spacing w:after="20" w:before="20"/>
-              <w:jc w:val="right"/>
-            </w:pPr>
-            <w:r>
-              <w:rPr>
-                <w:rFonts w:ascii="Calibri" w:cs="Calibri" w:eastAsia="Calibri" w:hAnsi="Calibri"/>
-                <w:b w:val="false"/>
-                <w:bCs w:val="false"/>
-                <w:color w:val="1A1A1A"/>
-                <w:sz w:val="20"/>
-                <w:szCs w:val="20"/>
-              </w:rPr>
-              <w:t xml:space="preserve">600.00</w:t>
-            </w:r>
-          </w:p>
-        </w:tc>
-      </w:tr>
-      <w:tr>
-        <w:tc>
-          <w:tcPr>
-            <w:tcW w:type="dxa" w:w="8178"/>
-            <w:gridSpan w:val="3"/>
-            <w:tcBorders>
-              <w:top w:val="single" w:color="808080" w:sz="6"/>
-              <w:left w:val="single" w:color="808080" w:sz="6"/>
-              <w:bottom w:val="single" w:color="808080" w:sz="6"/>
-              <w:right w:val="single" w:color="808080" w:sz="6"/>
-            </w:tcBorders>
-            <w:tcMar>
-              <w:top w:type="dxa" w:w="60"/>
-              <w:left w:type="dxa" w:w="100"/>
-              <w:bottom w:type="dxa" w:w="60"/>
-              <w:right w:type="dxa" w:w="100"/>
-            </w:tcMar>
-            <w:vAlign w:val="center"/>
-          </w:tcPr>
-          <w:p>
-            <w:pPr>
-              <w:spacing w:after="20" w:before="20"/>
-              <w:jc w:val="right"/>
-            </w:pPr>
-            <w:r>
-              <w:rPr>
-                <w:rFonts w:ascii="Calibri" w:cs="Calibri" w:eastAsia="Calibri" w:hAnsi="Calibri"/>
-                <w:b/>
-                <w:bCs/>
-                <w:color w:val="1A1A1A"/>
-                <w:sz w:val="20"/>
-                <w:szCs w:val="20"/>
-              </w:rPr>
-              <w:t xml:space="preserve">SUBTOTAL</w:t>
-            </w:r>
-          </w:p>
-        </w:tc>
-        <w:tc>
-          <w:tcPr>
-            <w:tcW w:type="dxa" w:w="2000"/>
-            <w:tcBorders>
-              <w:top w:val="single" w:color="808080" w:sz="6"/>
-              <w:left w:val="single" w:color="808080" w:sz="6"/>
-              <w:bottom w:val="single" w:color="808080" w:sz="6"/>
-              <w:right w:val="single" w:color="808080" w:sz="6"/>
-            </w:tcBorders>
-            <w:tcMar>
-              <w:top w:type="dxa" w:w="60"/>
-              <w:left w:type="dxa" w:w="100"/>
-              <w:bottom w:type="dxa" w:w="60"/>
-              <w:right w:type="dxa" w:w="100"/>
-            </w:tcMar>
-            <w:vAlign w:val="center"/>
-          </w:tcPr>
-          <w:p>
-            <w:pPr>
-              <w:spacing w:after="20" w:before="20"/>
-              <w:jc w:val="right"/>
-            </w:pPr>
-            <w:r>
-              <w:rPr>
-                <w:rFonts w:ascii="Calibri" w:cs="Calibri" w:eastAsia="Calibri" w:hAnsi="Calibri"/>
-                <w:b/>
-                <w:bCs/>
-                <w:color w:val="1A1A1A"/>
-                <w:sz w:val="20"/>
-                <w:szCs w:val="20"/>
-              </w:rPr>
-              <w:t xml:space="preserve">S/ 600.00</w:t>
-            </w:r>
-          </w:p>
-        </w:tc>
-      </w:tr>
-      <w:tr>
-        <w:tc>
-          <w:tcPr>
-            <w:tcW w:type="dxa" w:w="8178"/>
-            <w:gridSpan w:val="3"/>
-            <w:tcBorders>
-              <w:top w:val="single" w:color="808080" w:sz="6"/>
-              <w:left w:val="single" w:color="808080" w:sz="6"/>
-              <w:bottom w:val="single" w:color="808080" w:sz="6"/>
-              <w:right w:val="single" w:color="808080" w:sz="6"/>
-            </w:tcBorders>
-            <w:tcMar>
-              <w:top w:type="dxa" w:w="60"/>
-              <w:left w:type="dxa" w:w="100"/>
-              <w:bottom w:type="dxa" w:w="60"/>
-              <w:right w:type="dxa" w:w="100"/>
-            </w:tcMar>
-            <w:vAlign w:val="center"/>
-          </w:tcPr>
-          <w:p>
-            <w:pPr>
-              <w:spacing w:after="20" w:before="20"/>
-              <w:jc w:val="right"/>
-            </w:pPr>
-            <w:r>
-              <w:rPr>
-                <w:rFonts w:ascii="Calibri" w:cs="Calibri" w:eastAsia="Calibri" w:hAnsi="Calibri"/>
-                <w:b/>
-                <w:bCs/>
-                <w:color w:val="1A1A1A"/>
-                <w:sz w:val="20"/>
-                <w:szCs w:val="20"/>
-              </w:rPr>
-              <w:t xml:space="preserve">IGV (18%)</w:t>
-            </w:r>
-          </w:p>
-        </w:tc>
-        <w:tc>
-          <w:tcPr>
-            <w:tcW w:type="dxa" w:w="2000"/>
-            <w:tcBorders>
-              <w:top w:val="single" w:color="808080" w:sz="6"/>
-              <w:left w:val="single" w:color="808080" w:sz="6"/>
-              <w:bottom w:val="single" w:color="808080" w:sz="6"/>
-              <w:right w:val="single" w:color="808080" w:sz="6"/>
-            </w:tcBorders>
-            <w:tcMar>
-              <w:top w:type="dxa" w:w="60"/>
-              <w:left w:type="dxa" w:w="100"/>
-              <w:bottom w:type="dxa" w:w="60"/>
-              <w:right w:type="dxa" w:w="100"/>
-            </w:tcMar>
-            <w:vAlign w:val="center"/>
-          </w:tcPr>
-          <w:p>
-            <w:pPr>
-              <w:spacing w:after="20" w:before="20"/>
-              <w:jc w:val="right"/>
-            </w:pPr>
-            <w:r>
-              <w:rPr>
-                <w:rFonts w:ascii="Calibri" w:cs="Calibri" w:eastAsia="Calibri" w:hAnsi="Calibri"/>
-                <w:b/>
-                <w:bCs/>
-                <w:color w:val="1A1A1A"/>
-                <w:sz w:val="20"/>
-                <w:szCs w:val="20"/>
-              </w:rPr>
-              <w:t xml:space="preserve">S/ 108.00</w:t>
-            </w:r>
-          </w:p>
-        </w:tc>
-      </w:tr>
-      <w:tr>
-        <w:tc>
-          <w:tcPr>
-            <w:tcW w:type="dxa" w:w="8178"/>
-            <w:gridSpan w:val="3"/>
+            <w:tcW w:type="dxa" w:w="3200"/>
             <w:tcBorders>
               <w:top w:val="single" w:color="808080" w:sz="6"/>
               <w:left w:val="single" w:color="808080" w:sz="6"/>
@@ -1839,7 +1770,7 @@
     </w:tbl>
     <w:p>
       <w:pPr>
-        <w:spacing w:after="600" w:before="0"/>
+        <w:spacing w:after="280" w:before="0"/>
       </w:pPr>
       <w:r>
         <w:rPr>

</xml_diff>

<commit_message>
Un solo recuadro de descripcion, con los importes al pie derecho
Se descarta la division en dos columnas: hay un unico trabajo, y partir
el recuadro obligaba a inventar una segunda columna vacia.

El recuadro ocupa la mitad inferior de la hoja y dentro lleva, arriba,
el tablero con el trabajo (N°, trabajo por realizar, coste) en su tamano
normal; el espacio en blanco que queda debajo se deja intacto. Al pie
del recuadro van las notas a la izquierda y, a la derecha, subtotal,
IGV y total en formato compacto.

Co-Authored-By: Claude Opus 5 <noreply@anthropic.com>
Claude-Session: https://claude.ai/code/session_01EAxoWDzBm6hR4XtGMHBt1M
</commit_message>
<xml_diff>
--- a/Proforma-ABARCA-Nissan-BUX-222.docx
+++ b/Proforma-ABARCA-Nissan-BUX-222.docx
@@ -1322,16 +1322,15 @@
         </w:tblBorders>
       </w:tblPr>
       <w:tblGrid>
-        <w:gridCol w:w="5089"/>
-        <w:gridCol w:w="5089"/>
+        <w:gridCol w:w="10178"/>
       </w:tblGrid>
       <w:tr>
         <w:trPr>
-          <w:trHeight w:val="2900" w:hRule="atLeast"/>
+          <w:trHeight w:val="2500" w:hRule="atLeast"/>
         </w:trPr>
         <w:tc>
           <w:tcPr>
-            <w:tcW w:type="dxa" w:w="5089"/>
+            <w:tcW w:type="dxa" w:w="10178"/>
             <w:tcBorders>
               <w:top w:val="single" w:color="808080" w:sz="6"/>
               <w:left w:val="single" w:color="808080" w:sz="6"/>
@@ -1363,79 +1362,243 @@
               <w:t xml:space="preserve">SERVICIO DE PINTURA:</w:t>
             </w:r>
           </w:p>
-          <w:p>
-            <w:pPr>
-              <w:spacing w:after="50" w:before="0"/>
-            </w:pPr>
-            <w:r>
-              <w:rPr>
-                <w:rFonts w:ascii="Calibri" w:cs="Calibri" w:eastAsia="Calibri" w:hAnsi="Calibri"/>
-                <w:b w:val="false"/>
-                <w:bCs w:val="false"/>
-                <w:color w:val="1A1A1A"/>
-                <w:sz w:val="18"/>
-                <w:szCs w:val="18"/>
-              </w:rPr>
-              <w:t xml:space="preserve">1.-Pintura de panel izquierdo S/.600</w:t>
-            </w:r>
-          </w:p>
-        </w:tc>
-        <w:tc>
-          <w:tcPr>
-            <w:tcW w:type="dxa" w:w="5089"/>
-            <w:tcBorders>
-              <w:top w:val="single" w:color="808080" w:sz="6"/>
-              <w:left w:val="single" w:color="808080" w:sz="6"/>
-              <w:bottom w:val="none" w:color="FFFFFF" w:sz="0"/>
-              <w:right w:val="single" w:color="808080" w:sz="6"/>
-            </w:tcBorders>
-            <w:tcMar>
-              <w:top w:type="dxa" w:w="60"/>
-              <w:left w:type="dxa" w:w="100"/>
-              <w:bottom w:type="dxa" w:w="60"/>
-              <w:right w:type="dxa" w:w="100"/>
-            </w:tcMar>
-            <w:vAlign w:val="top"/>
-          </w:tcPr>
-          <w:p>
-            <w:pPr>
-              <w:spacing w:after="90" w:before="0"/>
-            </w:pPr>
-            <w:r>
-              <w:rPr>
-                <w:rFonts w:ascii="Calibri" w:cs="Calibri" w:eastAsia="Calibri" w:hAnsi="Calibri"/>
-                <w:b/>
-                <w:bCs/>
-                <w:color w:val="1A1A1A"/>
-                <w:sz w:val="19"/>
-                <w:szCs w:val="19"/>
-                <w:u w:val="single"/>
-              </w:rPr>
-              <w:t xml:space="preserve">SERVICIO DE CAMBIO E INSTALACION METÁLICO:</w:t>
-            </w:r>
-          </w:p>
-          <w:p>
-            <w:pPr>
-              <w:spacing w:after="0" w:before="0"/>
-            </w:pPr>
-            <w:r>
-              <w:rPr>
-                <w:rFonts w:ascii="Calibri" w:cs="Calibri" w:eastAsia="Calibri" w:hAnsi="Calibri"/>
-                <w:b w:val="false"/>
-                <w:bCs w:val="false"/>
-                <w:color w:val="1A1A1A"/>
-                <w:sz w:val="20"/>
-                <w:szCs w:val="20"/>
-              </w:rPr>
-              <w:t xml:space="preserve"/>
-            </w:r>
-          </w:p>
+          <w:tbl>
+            <w:tblPr>
+              <w:tblW w:type="dxa" w:w="9978"/>
+              <w:tblBorders>
+                <w:top w:val="single" w:color="auto" w:sz="4"/>
+                <w:left w:val="single" w:color="auto" w:sz="4"/>
+                <w:bottom w:val="single" w:color="auto" w:sz="4"/>
+                <w:right w:val="single" w:color="auto" w:sz="4"/>
+                <w:insideH w:val="single" w:color="auto" w:sz="4"/>
+                <w:insideV w:val="single" w:color="auto" w:sz="4"/>
+              </w:tblBorders>
+            </w:tblPr>
+            <w:tblGrid>
+              <w:gridCol w:w="560"/>
+              <w:gridCol w:w="8118"/>
+              <w:gridCol w:w="1300"/>
+            </w:tblGrid>
+            <w:tr>
+              <w:tc>
+                <w:tcPr>
+                  <w:tcW w:type="dxa" w:w="560"/>
+                  <w:tcBorders>
+                    <w:top w:val="none" w:color="FFFFFF" w:sz="0"/>
+                    <w:left w:val="none" w:color="FFFFFF" w:sz="0"/>
+                    <w:bottom w:val="single" w:color="D9D3CD" w:sz="4"/>
+                    <w:right w:val="none" w:color="FFFFFF" w:sz="0"/>
+                  </w:tcBorders>
+                  <w:tcMar>
+                    <w:top w:type="dxa" w:w="20"/>
+                    <w:left w:type="dxa" w:w="70"/>
+                    <w:bottom w:type="dxa" w:w="20"/>
+                    <w:right w:type="dxa" w:w="70"/>
+                  </w:tcMar>
+                  <w:vAlign w:val="top"/>
+                </w:tcPr>
+                <w:p>
+                  <w:pPr>
+                    <w:spacing w:after="30" w:before="0"/>
+                    <w:jc w:val="center"/>
+                  </w:pPr>
+                  <w:r>
+                    <w:rPr>
+                      <w:rFonts w:ascii="Calibri" w:cs="Calibri" w:eastAsia="Calibri" w:hAnsi="Calibri"/>
+                      <w:b/>
+                      <w:bCs/>
+                      <w:color w:val="6E6660"/>
+                      <w:sz w:val="18"/>
+                      <w:szCs w:val="18"/>
+                    </w:rPr>
+                    <w:t xml:space="preserve">N°</w:t>
+                  </w:r>
+                </w:p>
+              </w:tc>
+              <w:tc>
+                <w:tcPr>
+                  <w:tcW w:type="dxa" w:w="8118"/>
+                  <w:tcBorders>
+                    <w:top w:val="none" w:color="FFFFFF" w:sz="0"/>
+                    <w:left w:val="none" w:color="FFFFFF" w:sz="0"/>
+                    <w:bottom w:val="single" w:color="D9D3CD" w:sz="4"/>
+                    <w:right w:val="none" w:color="FFFFFF" w:sz="0"/>
+                  </w:tcBorders>
+                  <w:tcMar>
+                    <w:top w:type="dxa" w:w="20"/>
+                    <w:left w:type="dxa" w:w="70"/>
+                    <w:bottom w:type="dxa" w:w="20"/>
+                    <w:right w:type="dxa" w:w="70"/>
+                  </w:tcMar>
+                  <w:vAlign w:val="top"/>
+                </w:tcPr>
+                <w:p>
+                  <w:pPr>
+                    <w:spacing w:after="30" w:before="0"/>
+                  </w:pPr>
+                  <w:r>
+                    <w:rPr>
+                      <w:rFonts w:ascii="Calibri" w:cs="Calibri" w:eastAsia="Calibri" w:hAnsi="Calibri"/>
+                      <w:b/>
+                      <w:bCs/>
+                      <w:color w:val="6E6660"/>
+                      <w:sz w:val="18"/>
+                      <w:szCs w:val="18"/>
+                    </w:rPr>
+                    <w:t xml:space="preserve">TRABAJO POR REALIZAR</w:t>
+                  </w:r>
+                </w:p>
+              </w:tc>
+              <w:tc>
+                <w:tcPr>
+                  <w:tcW w:type="dxa" w:w="1300"/>
+                  <w:tcBorders>
+                    <w:top w:val="none" w:color="FFFFFF" w:sz="0"/>
+                    <w:left w:val="none" w:color="FFFFFF" w:sz="0"/>
+                    <w:bottom w:val="single" w:color="D9D3CD" w:sz="4"/>
+                    <w:right w:val="none" w:color="FFFFFF" w:sz="0"/>
+                  </w:tcBorders>
+                  <w:tcMar>
+                    <w:top w:type="dxa" w:w="20"/>
+                    <w:left w:type="dxa" w:w="70"/>
+                    <w:bottom w:type="dxa" w:w="20"/>
+                    <w:right w:type="dxa" w:w="70"/>
+                  </w:tcMar>
+                  <w:vAlign w:val="top"/>
+                </w:tcPr>
+                <w:p>
+                  <w:pPr>
+                    <w:spacing w:after="30" w:before="0"/>
+                    <w:jc w:val="right"/>
+                  </w:pPr>
+                  <w:r>
+                    <w:rPr>
+                      <w:rFonts w:ascii="Calibri" w:cs="Calibri" w:eastAsia="Calibri" w:hAnsi="Calibri"/>
+                      <w:b/>
+                      <w:bCs/>
+                      <w:color w:val="6E6660"/>
+                      <w:sz w:val="18"/>
+                      <w:szCs w:val="18"/>
+                    </w:rPr>
+                    <w:t xml:space="preserve">COSTE S/</w:t>
+                  </w:r>
+                </w:p>
+              </w:tc>
+            </w:tr>
+            <w:tr>
+              <w:tc>
+                <w:tcPr>
+                  <w:tcW w:type="dxa" w:w="560"/>
+                  <w:tcBorders>
+                    <w:top w:val="none" w:color="FFFFFF" w:sz="0"/>
+                    <w:left w:val="none" w:color="FFFFFF" w:sz="0"/>
+                    <w:bottom w:val="none" w:color="FFFFFF" w:sz="0"/>
+                    <w:right w:val="none" w:color="FFFFFF" w:sz="0"/>
+                  </w:tcBorders>
+                  <w:tcMar>
+                    <w:top w:type="dxa" w:w="20"/>
+                    <w:left w:type="dxa" w:w="70"/>
+                    <w:bottom w:type="dxa" w:w="20"/>
+                    <w:right w:type="dxa" w:w="70"/>
+                  </w:tcMar>
+                  <w:vAlign w:val="top"/>
+                </w:tcPr>
+                <w:p>
+                  <w:pPr>
+                    <w:spacing w:after="20" w:before="40"/>
+                    <w:jc w:val="center"/>
+                  </w:pPr>
+                  <w:r>
+                    <w:rPr>
+                      <w:rFonts w:ascii="Calibri" w:cs="Calibri" w:eastAsia="Calibri" w:hAnsi="Calibri"/>
+                      <w:b w:val="false"/>
+                      <w:bCs w:val="false"/>
+                      <w:color w:val="6E6660"/>
+                      <w:sz w:val="17"/>
+                      <w:szCs w:val="17"/>
+                    </w:rPr>
+                    <w:t xml:space="preserve">1</w:t>
+                  </w:r>
+                </w:p>
+              </w:tc>
+              <w:tc>
+                <w:tcPr>
+                  <w:tcW w:type="dxa" w:w="8118"/>
+                  <w:tcBorders>
+                    <w:top w:val="none" w:color="FFFFFF" w:sz="0"/>
+                    <w:left w:val="none" w:color="FFFFFF" w:sz="0"/>
+                    <w:bottom w:val="none" w:color="FFFFFF" w:sz="0"/>
+                    <w:right w:val="none" w:color="FFFFFF" w:sz="0"/>
+                  </w:tcBorders>
+                  <w:tcMar>
+                    <w:top w:type="dxa" w:w="20"/>
+                    <w:left w:type="dxa" w:w="70"/>
+                    <w:bottom w:type="dxa" w:w="20"/>
+                    <w:right w:type="dxa" w:w="70"/>
+                  </w:tcMar>
+                  <w:vAlign w:val="top"/>
+                </w:tcPr>
+                <w:p>
+                  <w:pPr>
+                    <w:spacing w:after="20" w:before="40"/>
+                  </w:pPr>
+                  <w:r>
+                    <w:rPr>
+                      <w:rFonts w:ascii="Calibri" w:cs="Calibri" w:eastAsia="Calibri" w:hAnsi="Calibri"/>
+                      <w:b w:val="false"/>
+                      <w:bCs w:val="false"/>
+                      <w:color w:val="1A1A1A"/>
+                      <w:sz w:val="19"/>
+                      <w:szCs w:val="19"/>
+                    </w:rPr>
+                    <w:t xml:space="preserve">Pintura de panel izquierdo</w:t>
+                  </w:r>
+                </w:p>
+              </w:tc>
+              <w:tc>
+                <w:tcPr>
+                  <w:tcW w:type="dxa" w:w="1300"/>
+                  <w:tcBorders>
+                    <w:top w:val="none" w:color="FFFFFF" w:sz="0"/>
+                    <w:left w:val="none" w:color="FFFFFF" w:sz="0"/>
+                    <w:bottom w:val="none" w:color="FFFFFF" w:sz="0"/>
+                    <w:right w:val="none" w:color="FFFFFF" w:sz="0"/>
+                  </w:tcBorders>
+                  <w:tcMar>
+                    <w:top w:type="dxa" w:w="20"/>
+                    <w:left w:type="dxa" w:w="70"/>
+                    <w:bottom w:type="dxa" w:w="20"/>
+                    <w:right w:type="dxa" w:w="70"/>
+                  </w:tcMar>
+                  <w:vAlign w:val="top"/>
+                </w:tcPr>
+                <w:p>
+                  <w:pPr>
+                    <w:spacing w:after="20" w:before="40"/>
+                    <w:jc w:val="right"/>
+                  </w:pPr>
+                  <w:r>
+                    <w:rPr>
+                      <w:rFonts w:ascii="Calibri" w:cs="Calibri" w:eastAsia="Calibri" w:hAnsi="Calibri"/>
+                      <w:b w:val="false"/>
+                      <w:bCs w:val="false"/>
+                      <w:color w:val="1A1A1A"/>
+                      <w:sz w:val="19"/>
+                      <w:szCs w:val="19"/>
+                    </w:rPr>
+                    <w:t xml:space="preserve">600</w:t>
+                  </w:r>
+                </w:p>
+              </w:tc>
+            </w:tr>
+          </w:tbl>
+          <w:p/>
         </w:tc>
       </w:tr>
       <w:tr>
         <w:tc>
           <w:tcPr>
-            <w:tcW w:type="dxa" w:w="5089"/>
+            <w:tcW w:type="dxa" w:w="10178"/>
             <w:tcBorders>
               <w:top w:val="none" w:color="FFFFFF" w:sz="0"/>
               <w:left w:val="single" w:color="808080" w:sz="6"/>
@@ -1450,321 +1613,329 @@
             </w:tcMar>
             <w:vAlign w:val="bottom"/>
           </w:tcPr>
-          <w:p>
-            <w:r>
-              <w:rPr>
-                <w:rFonts w:ascii="Calibri" w:cs="Calibri" w:eastAsia="Calibri" w:hAnsi="Calibri"/>
-                <w:b w:val="false"/>
-                <w:bCs w:val="false"/>
-                <w:color w:val="1A1A1A"/>
-                <w:sz w:val="20"/>
-                <w:szCs w:val="20"/>
-              </w:rPr>
-              <w:t xml:space="preserve"/>
-            </w:r>
-          </w:p>
-        </w:tc>
-        <w:tc>
-          <w:tcPr>
-            <w:tcW w:type="dxa" w:w="5089"/>
-            <w:tcBorders>
-              <w:top w:val="none" w:color="FFFFFF" w:sz="0"/>
-              <w:left w:val="single" w:color="808080" w:sz="6"/>
-              <w:bottom w:val="single" w:color="808080" w:sz="6"/>
-              <w:right w:val="single" w:color="808080" w:sz="6"/>
-            </w:tcBorders>
-            <w:tcMar>
-              <w:top w:type="dxa" w:w="60"/>
-              <w:left w:type="dxa" w:w="100"/>
-              <w:bottom w:type="dxa" w:w="60"/>
-              <w:right w:type="dxa" w:w="100"/>
-            </w:tcMar>
-            <w:vAlign w:val="bottom"/>
-          </w:tcPr>
-          <w:p>
-            <w:pPr>
-              <w:spacing w:after="0" w:before="0"/>
-            </w:pPr>
-            <w:r>
-              <w:rPr>
-                <w:rFonts w:ascii="Calibri" w:cs="Calibri" w:eastAsia="Calibri" w:hAnsi="Calibri"/>
-                <w:b w:val="false"/>
-                <w:bCs w:val="false"/>
-                <w:color w:val="1A1A1A"/>
-                <w:sz w:val="17"/>
-                <w:szCs w:val="17"/>
-              </w:rPr>
-              <w:t xml:space="preserve">***TRABAJO A REALIZAR EN 2 A 4 DÍAS HÁBILES.</w:t>
-            </w:r>
-          </w:p>
-          <w:p>
-            <w:pPr>
-              <w:spacing w:after="0" w:before="40"/>
-            </w:pPr>
-            <w:r>
-              <w:rPr>
-                <w:rFonts w:ascii="Calibri" w:cs="Calibri" w:eastAsia="Calibri" w:hAnsi="Calibri"/>
-                <w:b w:val="false"/>
-                <w:bCs w:val="false"/>
-                <w:color w:val="595959"/>
-                <w:sz w:val="13"/>
-                <w:szCs w:val="13"/>
-              </w:rPr>
-              <w:t xml:space="preserve">***Todo presupuesto con factura se aplica más el 18% de IGV.</w:t>
-            </w:r>
-          </w:p>
-        </w:tc>
-      </w:tr>
-    </w:tbl>
-    <w:p>
-      <w:pPr>
-        <w:spacing w:after="120" w:before="0"/>
-      </w:pPr>
-      <w:r>
-        <w:rPr>
-          <w:rFonts w:ascii="Calibri" w:cs="Calibri" w:eastAsia="Calibri" w:hAnsi="Calibri"/>
-          <w:b w:val="false"/>
-          <w:bCs w:val="false"/>
-          <w:color w:val="1A1A1A"/>
-          <w:sz w:val="20"/>
-          <w:szCs w:val="20"/>
-        </w:rPr>
-        <w:t xml:space="preserve"/>
-      </w:r>
-    </w:p>
-    <w:tbl>
-      <w:tblPr>
-        <w:tblW w:type="dxa" w:w="5200"/>
-        <w:jc w:val="right"/>
-        <w:tblBorders>
-          <w:top w:val="single" w:color="auto" w:sz="4"/>
-          <w:left w:val="single" w:color="auto" w:sz="4"/>
-          <w:bottom w:val="single" w:color="auto" w:sz="4"/>
-          <w:right w:val="single" w:color="auto" w:sz="4"/>
-          <w:insideH w:val="single" w:color="auto" w:sz="4"/>
-          <w:insideV w:val="single" w:color="auto" w:sz="4"/>
-        </w:tblBorders>
-      </w:tblPr>
-      <w:tblGrid>
-        <w:gridCol w:w="3200"/>
-        <w:gridCol w:w="2000"/>
-      </w:tblGrid>
-      <w:tr>
-        <w:tc>
-          <w:tcPr>
-            <w:tcW w:type="dxa" w:w="3200"/>
-            <w:tcBorders>
-              <w:top w:val="single" w:color="808080" w:sz="6"/>
-              <w:left w:val="single" w:color="808080" w:sz="6"/>
-              <w:bottom w:val="single" w:color="808080" w:sz="6"/>
-              <w:right w:val="single" w:color="808080" w:sz="6"/>
-            </w:tcBorders>
-            <w:tcMar>
-              <w:top w:type="dxa" w:w="60"/>
-              <w:left w:type="dxa" w:w="100"/>
-              <w:bottom w:type="dxa" w:w="60"/>
-              <w:right w:type="dxa" w:w="100"/>
-            </w:tcMar>
-            <w:vAlign w:val="center"/>
-          </w:tcPr>
-          <w:p>
-            <w:pPr>
-              <w:spacing w:after="20" w:before="20"/>
-              <w:jc w:val="right"/>
-            </w:pPr>
-            <w:r>
-              <w:rPr>
-                <w:rFonts w:ascii="Calibri" w:cs="Calibri" w:eastAsia="Calibri" w:hAnsi="Calibri"/>
-                <w:b/>
-                <w:bCs/>
-                <w:color w:val="1A1A1A"/>
-                <w:sz w:val="20"/>
-                <w:szCs w:val="20"/>
-              </w:rPr>
-              <w:t xml:space="preserve">SUBTOTAL</w:t>
-            </w:r>
-          </w:p>
-        </w:tc>
-        <w:tc>
-          <w:tcPr>
-            <w:tcW w:type="dxa" w:w="2000"/>
-            <w:tcBorders>
-              <w:top w:val="single" w:color="808080" w:sz="6"/>
-              <w:left w:val="single" w:color="808080" w:sz="6"/>
-              <w:bottom w:val="single" w:color="808080" w:sz="6"/>
-              <w:right w:val="single" w:color="808080" w:sz="6"/>
-            </w:tcBorders>
-            <w:tcMar>
-              <w:top w:type="dxa" w:w="60"/>
-              <w:left w:type="dxa" w:w="100"/>
-              <w:bottom w:type="dxa" w:w="60"/>
-              <w:right w:type="dxa" w:w="100"/>
-            </w:tcMar>
-            <w:vAlign w:val="center"/>
-          </w:tcPr>
-          <w:p>
-            <w:pPr>
-              <w:spacing w:after="20" w:before="20"/>
-              <w:jc w:val="right"/>
-            </w:pPr>
-            <w:r>
-              <w:rPr>
-                <w:rFonts w:ascii="Calibri" w:cs="Calibri" w:eastAsia="Calibri" w:hAnsi="Calibri"/>
-                <w:b/>
-                <w:bCs/>
-                <w:color w:val="1A1A1A"/>
-                <w:sz w:val="20"/>
-                <w:szCs w:val="20"/>
-              </w:rPr>
-              <w:t xml:space="preserve">S/ 600.00</w:t>
-            </w:r>
-          </w:p>
-        </w:tc>
-      </w:tr>
-      <w:tr>
-        <w:tc>
-          <w:tcPr>
-            <w:tcW w:type="dxa" w:w="3200"/>
-            <w:tcBorders>
-              <w:top w:val="single" w:color="808080" w:sz="6"/>
-              <w:left w:val="single" w:color="808080" w:sz="6"/>
-              <w:bottom w:val="single" w:color="808080" w:sz="6"/>
-              <w:right w:val="single" w:color="808080" w:sz="6"/>
-            </w:tcBorders>
-            <w:tcMar>
-              <w:top w:type="dxa" w:w="60"/>
-              <w:left w:type="dxa" w:w="100"/>
-              <w:bottom w:type="dxa" w:w="60"/>
-              <w:right w:type="dxa" w:w="100"/>
-            </w:tcMar>
-            <w:vAlign w:val="center"/>
-          </w:tcPr>
-          <w:p>
-            <w:pPr>
-              <w:spacing w:after="20" w:before="20"/>
-              <w:jc w:val="right"/>
-            </w:pPr>
-            <w:r>
-              <w:rPr>
-                <w:rFonts w:ascii="Calibri" w:cs="Calibri" w:eastAsia="Calibri" w:hAnsi="Calibri"/>
-                <w:b/>
-                <w:bCs/>
-                <w:color w:val="1A1A1A"/>
-                <w:sz w:val="20"/>
-                <w:szCs w:val="20"/>
-              </w:rPr>
-              <w:t xml:space="preserve">IGV (18%)</w:t>
-            </w:r>
-          </w:p>
-        </w:tc>
-        <w:tc>
-          <w:tcPr>
-            <w:tcW w:type="dxa" w:w="2000"/>
-            <w:tcBorders>
-              <w:top w:val="single" w:color="808080" w:sz="6"/>
-              <w:left w:val="single" w:color="808080" w:sz="6"/>
-              <w:bottom w:val="single" w:color="808080" w:sz="6"/>
-              <w:right w:val="single" w:color="808080" w:sz="6"/>
-            </w:tcBorders>
-            <w:tcMar>
-              <w:top w:type="dxa" w:w="60"/>
-              <w:left w:type="dxa" w:w="100"/>
-              <w:bottom w:type="dxa" w:w="60"/>
-              <w:right w:type="dxa" w:w="100"/>
-            </w:tcMar>
-            <w:vAlign w:val="center"/>
-          </w:tcPr>
-          <w:p>
-            <w:pPr>
-              <w:spacing w:after="20" w:before="20"/>
-              <w:jc w:val="right"/>
-            </w:pPr>
-            <w:r>
-              <w:rPr>
-                <w:rFonts w:ascii="Calibri" w:cs="Calibri" w:eastAsia="Calibri" w:hAnsi="Calibri"/>
-                <w:b/>
-                <w:bCs/>
-                <w:color w:val="1A1A1A"/>
-                <w:sz w:val="20"/>
-                <w:szCs w:val="20"/>
-              </w:rPr>
-              <w:t xml:space="preserve">S/ 108.00</w:t>
-            </w:r>
-          </w:p>
-        </w:tc>
-      </w:tr>
-      <w:tr>
-        <w:tc>
-          <w:tcPr>
-            <w:tcW w:type="dxa" w:w="3200"/>
-            <w:tcBorders>
-              <w:top w:val="single" w:color="808080" w:sz="6"/>
-              <w:left w:val="single" w:color="808080" w:sz="6"/>
-              <w:bottom w:val="single" w:color="808080" w:sz="6"/>
-              <w:right w:val="single" w:color="808080" w:sz="6"/>
-            </w:tcBorders>
-            <w:shd w:fill="D9D9D9" w:color="auto" w:val="clear"/>
-            <w:tcMar>
-              <w:top w:type="dxa" w:w="60"/>
-              <w:left w:type="dxa" w:w="100"/>
-              <w:bottom w:type="dxa" w:w="60"/>
-              <w:right w:type="dxa" w:w="100"/>
-            </w:tcMar>
-            <w:vAlign w:val="center"/>
-          </w:tcPr>
-          <w:p>
-            <w:pPr>
-              <w:spacing w:after="20" w:before="20"/>
-              <w:jc w:val="right"/>
-            </w:pPr>
-            <w:r>
-              <w:rPr>
-                <w:rFonts w:ascii="Calibri" w:cs="Calibri" w:eastAsia="Calibri" w:hAnsi="Calibri"/>
-                <w:b/>
-                <w:bCs/>
-                <w:color w:val="1A1A1A"/>
-                <w:sz w:val="20"/>
-                <w:szCs w:val="20"/>
-              </w:rPr>
-              <w:t xml:space="preserve">TOTAL</w:t>
-            </w:r>
-          </w:p>
-        </w:tc>
-        <w:tc>
-          <w:tcPr>
-            <w:tcW w:type="dxa" w:w="2000"/>
-            <w:tcBorders>
-              <w:top w:val="single" w:color="808080" w:sz="6"/>
-              <w:left w:val="single" w:color="808080" w:sz="6"/>
-              <w:bottom w:val="single" w:color="808080" w:sz="6"/>
-              <w:right w:val="single" w:color="808080" w:sz="6"/>
-            </w:tcBorders>
-            <w:shd w:fill="D9D9D9" w:color="auto" w:val="clear"/>
-            <w:tcMar>
-              <w:top w:type="dxa" w:w="60"/>
-              <w:left w:type="dxa" w:w="100"/>
-              <w:bottom w:type="dxa" w:w="60"/>
-              <w:right w:type="dxa" w:w="100"/>
-            </w:tcMar>
-            <w:vAlign w:val="center"/>
-          </w:tcPr>
-          <w:p>
-            <w:pPr>
-              <w:spacing w:after="20" w:before="20"/>
-              <w:jc w:val="right"/>
-            </w:pPr>
-            <w:r>
-              <w:rPr>
-                <w:rFonts w:ascii="Calibri" w:cs="Calibri" w:eastAsia="Calibri" w:hAnsi="Calibri"/>
-                <w:b/>
-                <w:bCs/>
-                <w:color w:val="C00000"/>
-                <w:sz w:val="22"/>
-                <w:szCs w:val="22"/>
-              </w:rPr>
-              <w:t xml:space="preserve">S/ 708.00</w:t>
-            </w:r>
-          </w:p>
+          <w:tbl>
+            <w:tblPr>
+              <w:tblW w:type="dxa" w:w="9978"/>
+              <w:tblBorders>
+                <w:top w:val="single" w:color="auto" w:sz="4"/>
+                <w:left w:val="single" w:color="auto" w:sz="4"/>
+                <w:bottom w:val="single" w:color="auto" w:sz="4"/>
+                <w:right w:val="single" w:color="auto" w:sz="4"/>
+                <w:insideH w:val="single" w:color="auto" w:sz="4"/>
+                <w:insideV w:val="single" w:color="auto" w:sz="4"/>
+              </w:tblBorders>
+            </w:tblPr>
+            <w:tblGrid>
+              <w:gridCol w:w="5800"/>
+              <w:gridCol w:w="4178"/>
+            </w:tblGrid>
+            <w:tr>
+              <w:tc>
+                <w:tcPr>
+                  <w:tcW w:type="dxa" w:w="5800"/>
+                  <w:tcBorders>
+                    <w:top w:val="none" w:color="FFFFFF" w:sz="0"/>
+                    <w:left w:val="none" w:color="FFFFFF" w:sz="0"/>
+                    <w:bottom w:val="none" w:color="FFFFFF" w:sz="0"/>
+                    <w:right w:val="none" w:color="FFFFFF" w:sz="0"/>
+                  </w:tcBorders>
+                  <w:tcMar>
+                    <w:top w:type="dxa" w:w="20"/>
+                    <w:left w:type="dxa" w:w="70"/>
+                    <w:bottom w:type="dxa" w:w="20"/>
+                    <w:right w:type="dxa" w:w="70"/>
+                  </w:tcMar>
+                  <w:vAlign w:val="bottom"/>
+                </w:tcPr>
+                <w:p>
+                  <w:pPr>
+                    <w:spacing w:after="0" w:before="0"/>
+                  </w:pPr>
+                  <w:r>
+                    <w:rPr>
+                      <w:rFonts w:ascii="Calibri" w:cs="Calibri" w:eastAsia="Calibri" w:hAnsi="Calibri"/>
+                      <w:b w:val="false"/>
+                      <w:bCs w:val="false"/>
+                      <w:color w:val="1A1A1A"/>
+                      <w:sz w:val="16"/>
+                      <w:szCs w:val="16"/>
+                    </w:rPr>
+                    <w:t xml:space="preserve">***TRABAJO A REALIZAR EN 2 A 4 DÍAS HÁBILES.</w:t>
+                  </w:r>
+                </w:p>
+                <w:p>
+                  <w:pPr>
+                    <w:spacing w:after="0" w:before="30"/>
+                  </w:pPr>
+                  <w:r>
+                    <w:rPr>
+                      <w:rFonts w:ascii="Calibri" w:cs="Calibri" w:eastAsia="Calibri" w:hAnsi="Calibri"/>
+                      <w:b w:val="false"/>
+                      <w:bCs w:val="false"/>
+                      <w:color w:val="6E6660"/>
+                      <w:sz w:val="14"/>
+                      <w:szCs w:val="14"/>
+                    </w:rPr>
+                    <w:t xml:space="preserve">***Todo presupuesto con factura se aplica más el 18% de IGV.</w:t>
+                  </w:r>
+                </w:p>
+              </w:tc>
+              <w:tc>
+                <w:tcPr>
+                  <w:tcW w:type="dxa" w:w="4178"/>
+                  <w:tcBorders>
+                    <w:top w:val="none" w:color="FFFFFF" w:sz="0"/>
+                    <w:left w:val="none" w:color="FFFFFF" w:sz="0"/>
+                    <w:bottom w:val="none" w:color="FFFFFF" w:sz="0"/>
+                    <w:right w:val="none" w:color="FFFFFF" w:sz="0"/>
+                  </w:tcBorders>
+                  <w:tcMar>
+                    <w:top w:type="dxa" w:w="20"/>
+                    <w:left w:type="dxa" w:w="0"/>
+                    <w:bottom w:type="dxa" w:w="20"/>
+                    <w:right w:type="dxa" w:w="70"/>
+                  </w:tcMar>
+                  <w:vAlign w:val="bottom"/>
+                </w:tcPr>
+                <w:tbl>
+                  <w:tblPr>
+                    <w:tblW w:type="dxa" w:w="3978"/>
+                    <w:jc w:val="right"/>
+                    <w:tblBorders>
+                      <w:top w:val="single" w:color="auto" w:sz="4"/>
+                      <w:left w:val="single" w:color="auto" w:sz="4"/>
+                      <w:bottom w:val="single" w:color="auto" w:sz="4"/>
+                      <w:right w:val="single" w:color="auto" w:sz="4"/>
+                      <w:insideH w:val="single" w:color="auto" w:sz="4"/>
+                      <w:insideV w:val="single" w:color="auto" w:sz="4"/>
+                    </w:tblBorders>
+                  </w:tblPr>
+                  <w:tblGrid>
+                    <w:gridCol w:w="2300"/>
+                    <w:gridCol w:w="1678"/>
+                  </w:tblGrid>
+                  <w:tr>
+                    <w:tc>
+                      <w:tcPr>
+                        <w:tcW w:type="dxa" w:w="2300"/>
+                        <w:tcBorders>
+                          <w:top w:val="none" w:color="FFFFFF" w:sz="0"/>
+                          <w:left w:val="none" w:color="FFFFFF" w:sz="0"/>
+                          <w:bottom w:val="none" w:color="FFFFFF" w:sz="0"/>
+                          <w:right w:val="none" w:color="FFFFFF" w:sz="0"/>
+                        </w:tcBorders>
+                        <w:tcMar>
+                          <w:top w:type="dxa" w:w="20"/>
+                          <w:left w:type="dxa" w:w="70"/>
+                          <w:bottom w:type="dxa" w:w="20"/>
+                          <w:right w:type="dxa" w:w="70"/>
+                        </w:tcMar>
+                        <w:vAlign w:val="top"/>
+                      </w:tcPr>
+                      <w:p>
+                        <w:pPr>
+                          <w:spacing w:after="20" w:before="20"/>
+                          <w:jc w:val="right"/>
+                        </w:pPr>
+                        <w:r>
+                          <w:rPr>
+                            <w:rFonts w:ascii="Calibri" w:cs="Calibri" w:eastAsia="Calibri" w:hAnsi="Calibri"/>
+                            <w:b/>
+                            <w:bCs/>
+                            <w:color w:val="6E6660"/>
+                            <w:sz w:val="18"/>
+                            <w:szCs w:val="18"/>
+                          </w:rPr>
+                          <w:t xml:space="preserve">SUBTOTAL</w:t>
+                        </w:r>
+                      </w:p>
+                    </w:tc>
+                    <w:tc>
+                      <w:tcPr>
+                        <w:tcW w:type="dxa" w:w="1678"/>
+                        <w:tcBorders>
+                          <w:top w:val="none" w:color="FFFFFF" w:sz="0"/>
+                          <w:left w:val="none" w:color="FFFFFF" w:sz="0"/>
+                          <w:bottom w:val="none" w:color="FFFFFF" w:sz="0"/>
+                          <w:right w:val="none" w:color="FFFFFF" w:sz="0"/>
+                        </w:tcBorders>
+                        <w:tcMar>
+                          <w:top w:type="dxa" w:w="20"/>
+                          <w:left w:type="dxa" w:w="70"/>
+                          <w:bottom w:type="dxa" w:w="20"/>
+                          <w:right w:type="dxa" w:w="70"/>
+                        </w:tcMar>
+                        <w:vAlign w:val="top"/>
+                      </w:tcPr>
+                      <w:p>
+                        <w:pPr>
+                          <w:spacing w:after="20" w:before="20"/>
+                          <w:jc w:val="right"/>
+                        </w:pPr>
+                        <w:r>
+                          <w:rPr>
+                            <w:rFonts w:ascii="Calibri" w:cs="Calibri" w:eastAsia="Calibri" w:hAnsi="Calibri"/>
+                            <w:b w:val="false"/>
+                            <w:bCs w:val="false"/>
+                            <w:color w:val="1A1A1A"/>
+                            <w:sz w:val="18"/>
+                            <w:szCs w:val="18"/>
+                          </w:rPr>
+                          <w:t xml:space="preserve">S/ 600.00</w:t>
+                        </w:r>
+                      </w:p>
+                    </w:tc>
+                  </w:tr>
+                  <w:tr>
+                    <w:tc>
+                      <w:tcPr>
+                        <w:tcW w:type="dxa" w:w="2300"/>
+                        <w:tcBorders>
+                          <w:top w:val="none" w:color="FFFFFF" w:sz="0"/>
+                          <w:left w:val="none" w:color="FFFFFF" w:sz="0"/>
+                          <w:bottom w:val="none" w:color="FFFFFF" w:sz="0"/>
+                          <w:right w:val="none" w:color="FFFFFF" w:sz="0"/>
+                        </w:tcBorders>
+                        <w:tcMar>
+                          <w:top w:type="dxa" w:w="20"/>
+                          <w:left w:type="dxa" w:w="70"/>
+                          <w:bottom w:type="dxa" w:w="20"/>
+                          <w:right w:type="dxa" w:w="70"/>
+                        </w:tcMar>
+                        <w:vAlign w:val="top"/>
+                      </w:tcPr>
+                      <w:p>
+                        <w:pPr>
+                          <w:spacing w:after="20" w:before="20"/>
+                          <w:jc w:val="right"/>
+                        </w:pPr>
+                        <w:r>
+                          <w:rPr>
+                            <w:rFonts w:ascii="Calibri" w:cs="Calibri" w:eastAsia="Calibri" w:hAnsi="Calibri"/>
+                            <w:b/>
+                            <w:bCs/>
+                            <w:color w:val="6E6660"/>
+                            <w:sz w:val="18"/>
+                            <w:szCs w:val="18"/>
+                          </w:rPr>
+                          <w:t xml:space="preserve">IGV (18%)</w:t>
+                        </w:r>
+                      </w:p>
+                    </w:tc>
+                    <w:tc>
+                      <w:tcPr>
+                        <w:tcW w:type="dxa" w:w="1678"/>
+                        <w:tcBorders>
+                          <w:top w:val="none" w:color="FFFFFF" w:sz="0"/>
+                          <w:left w:val="none" w:color="FFFFFF" w:sz="0"/>
+                          <w:bottom w:val="none" w:color="FFFFFF" w:sz="0"/>
+                          <w:right w:val="none" w:color="FFFFFF" w:sz="0"/>
+                        </w:tcBorders>
+                        <w:tcMar>
+                          <w:top w:type="dxa" w:w="20"/>
+                          <w:left w:type="dxa" w:w="70"/>
+                          <w:bottom w:type="dxa" w:w="20"/>
+                          <w:right w:type="dxa" w:w="70"/>
+                        </w:tcMar>
+                        <w:vAlign w:val="top"/>
+                      </w:tcPr>
+                      <w:p>
+                        <w:pPr>
+                          <w:spacing w:after="20" w:before="20"/>
+                          <w:jc w:val="right"/>
+                        </w:pPr>
+                        <w:r>
+                          <w:rPr>
+                            <w:rFonts w:ascii="Calibri" w:cs="Calibri" w:eastAsia="Calibri" w:hAnsi="Calibri"/>
+                            <w:b w:val="false"/>
+                            <w:bCs w:val="false"/>
+                            <w:color w:val="1A1A1A"/>
+                            <w:sz w:val="18"/>
+                            <w:szCs w:val="18"/>
+                          </w:rPr>
+                          <w:t xml:space="preserve">S/ 108.00</w:t>
+                        </w:r>
+                      </w:p>
+                    </w:tc>
+                  </w:tr>
+                  <w:tr>
+                    <w:tc>
+                      <w:tcPr>
+                        <w:tcW w:type="dxa" w:w="2300"/>
+                        <w:tcBorders>
+                          <w:top w:val="single" w:color="1A1A1A" w:sz="6"/>
+                          <w:left w:val="none" w:color="FFFFFF" w:sz="0"/>
+                          <w:bottom w:val="none" w:color="FFFFFF" w:sz="0"/>
+                          <w:right w:val="none" w:color="FFFFFF" w:sz="0"/>
+                        </w:tcBorders>
+                        <w:tcMar>
+                          <w:top w:type="dxa" w:w="20"/>
+                          <w:left w:type="dxa" w:w="70"/>
+                          <w:bottom w:type="dxa" w:w="20"/>
+                          <w:right w:type="dxa" w:w="70"/>
+                        </w:tcMar>
+                        <w:vAlign w:val="top"/>
+                      </w:tcPr>
+                      <w:p>
+                        <w:pPr>
+                          <w:spacing w:after="20" w:before="60"/>
+                          <w:jc w:val="right"/>
+                        </w:pPr>
+                        <w:r>
+                          <w:rPr>
+                            <w:rFonts w:ascii="Calibri" w:cs="Calibri" w:eastAsia="Calibri" w:hAnsi="Calibri"/>
+                            <w:b/>
+                            <w:bCs/>
+                            <w:color w:val="1A1A1A"/>
+                            <w:sz w:val="20"/>
+                            <w:szCs w:val="20"/>
+                          </w:rPr>
+                          <w:t xml:space="preserve">TOTAL</w:t>
+                        </w:r>
+                      </w:p>
+                    </w:tc>
+                    <w:tc>
+                      <w:tcPr>
+                        <w:tcW w:type="dxa" w:w="1678"/>
+                        <w:tcBorders>
+                          <w:top w:val="single" w:color="1A1A1A" w:sz="6"/>
+                          <w:left w:val="none" w:color="FFFFFF" w:sz="0"/>
+                          <w:bottom w:val="none" w:color="FFFFFF" w:sz="0"/>
+                          <w:right w:val="none" w:color="FFFFFF" w:sz="0"/>
+                        </w:tcBorders>
+                        <w:tcMar>
+                          <w:top w:type="dxa" w:w="20"/>
+                          <w:left w:type="dxa" w:w="70"/>
+                          <w:bottom w:type="dxa" w:w="20"/>
+                          <w:right w:type="dxa" w:w="70"/>
+                        </w:tcMar>
+                        <w:vAlign w:val="top"/>
+                      </w:tcPr>
+                      <w:p>
+                        <w:pPr>
+                          <w:spacing w:after="20" w:before="60"/>
+                          <w:jc w:val="right"/>
+                        </w:pPr>
+                        <w:r>
+                          <w:rPr>
+                            <w:rFonts w:ascii="Calibri" w:cs="Calibri" w:eastAsia="Calibri" w:hAnsi="Calibri"/>
+                            <w:b/>
+                            <w:bCs/>
+                            <w:color w:val="C00000"/>
+                            <w:sz w:val="21"/>
+                            <w:szCs w:val="21"/>
+                          </w:rPr>
+                          <w:t xml:space="preserve">S/ 708.00</w:t>
+                        </w:r>
+                      </w:p>
+                    </w:tc>
+                  </w:tr>
+                </w:tbl>
+                <w:p/>
+              </w:tc>
+            </w:tr>
+          </w:tbl>
+          <w:p/>
         </w:tc>
       </w:tr>
     </w:tbl>

</xml_diff>